<commit_message>
feat: actualizar CVs en espanol e ingles y regenerar miniaturas de previsualizacion en alta resolucion
</commit_message>
<xml_diff>
--- a/docs/docs/Carlos_Juarez_CV.docx
+++ b/docs/docs/Carlos_Juarez_CV.docx
@@ -4089,23 +4089,7 @@
           <w:sz w:val="20"/>
           <w:szCs w:val="20"/>
         </w:rPr>
-        <w:t>Linked</w:t>
-      </w:r>
-      <w:r>
-        <w:rPr>
-          <w:rFonts w:asciiTheme="majorHAnsi" w:hAnsiTheme="majorHAnsi" w:cstheme="majorHAnsi"/>
-          <w:sz w:val="20"/>
-          <w:szCs w:val="20"/>
-        </w:rPr>
-        <w:t>l</w:t>
-      </w:r>
-      <w:r>
-        <w:rPr>
-          <w:rFonts w:asciiTheme="majorHAnsi" w:hAnsiTheme="majorHAnsi" w:cstheme="majorHAnsi"/>
-          <w:sz w:val="20"/>
-          <w:szCs w:val="20"/>
-        </w:rPr>
-        <w:t>n</w:t>
+        <w:t>Linkedln</w:t>
       </w:r>
       <w:proofErr w:type="spellEnd"/>
       <w:r>
@@ -4161,7 +4145,7 @@
             <w:sz w:val="20"/>
             <w:szCs w:val="20"/>
           </w:rPr>
-          <w:t>https://portfolio-1rrp.</w:t>
+          <w:t>https://portfolio-carlosjua</w:t>
         </w:r>
         <w:r>
           <w:rPr>
@@ -4170,7 +4154,7 @@
             <w:sz w:val="20"/>
             <w:szCs w:val="20"/>
           </w:rPr>
-          <w:t>o</w:t>
+          <w:t>r</w:t>
         </w:r>
         <w:r>
           <w:rPr>
@@ -4179,9 +4163,17 @@
             <w:sz w:val="20"/>
             <w:szCs w:val="20"/>
           </w:rPr>
-          <w:t>nrender.com/</w:t>
+          <w:t>ez.onrender.com</w:t>
         </w:r>
       </w:hyperlink>
+      <w:r>
+        <w:rPr>
+          <w:rFonts w:asciiTheme="majorHAnsi" w:hAnsiTheme="majorHAnsi" w:cstheme="majorHAnsi"/>
+          <w:sz w:val="20"/>
+          <w:szCs w:val="20"/>
+        </w:rPr>
+        <w:t xml:space="preserve"> </w:t>
+      </w:r>
     </w:p>
     <w:sectPr>
       <w:footerReference w:type="default" r:id="rId11"/>

</xml_diff>

<commit_message>
fix(cv): reexportar PDF con motor nativo Word, fijar PageLayout OneColumn continuo y regenerar previsualizacion completa de 2 paginas
</commit_message>
<xml_diff>
--- a/docs/docs/Carlos_Juarez_CV.docx
+++ b/docs/docs/Carlos_Juarez_CV.docx
@@ -40,39 +40,8 @@
           <w:bCs/>
           <w:color w:val="7F7F7F" w:themeColor="text1" w:themeTint="80"/>
         </w:rPr>
-        <w:t xml:space="preserve">Senior AI Full Stack </w:t>
-      </w:r>
-      <w:proofErr w:type="spellStart"/>
-      <w:r>
-        <w:rPr>
-          <w:rFonts w:asciiTheme="majorHAnsi" w:hAnsiTheme="majorHAnsi" w:cstheme="majorHAnsi"/>
-          <w:b/>
-          <w:bCs/>
-          <w:color w:val="7F7F7F" w:themeColor="text1" w:themeTint="80"/>
-        </w:rPr>
-        <w:t>Developer</w:t>
-      </w:r>
-      <w:proofErr w:type="spellEnd"/>
-      <w:r>
-        <w:rPr>
-          <w:rFonts w:asciiTheme="majorHAnsi" w:hAnsiTheme="majorHAnsi" w:cstheme="majorHAnsi"/>
-          <w:b/>
-          <w:bCs/>
-          <w:color w:val="7F7F7F" w:themeColor="text1" w:themeTint="80"/>
-        </w:rPr>
-        <w:t xml:space="preserve"> | GenAI &amp; AI </w:t>
-      </w:r>
-      <w:proofErr w:type="spellStart"/>
-      <w:r>
-        <w:rPr>
-          <w:rFonts w:asciiTheme="majorHAnsi" w:hAnsiTheme="majorHAnsi" w:cstheme="majorHAnsi"/>
-          <w:b/>
-          <w:bCs/>
-          <w:color w:val="7F7F7F" w:themeColor="text1" w:themeTint="80"/>
-        </w:rPr>
-        <w:t>Agents</w:t>
-      </w:r>
-      <w:proofErr w:type="spellEnd"/>
+        <w:t>Senior AI Full Stack Developer | GenAI &amp; AI Agents</w:t>
+      </w:r>
     </w:p>
     <w:p>
       <w:pPr>
@@ -118,9 +87,40 @@
           <w:sz w:val="20"/>
           <w:szCs w:val="20"/>
         </w:rPr>
-        <w:t xml:space="preserve">Full Stack </w:t>
-      </w:r>
-      <w:proofErr w:type="spellStart"/>
+        <w:t>Full Stack Developer &amp; GenAI</w:t>
+      </w:r>
+      <w:r>
+        <w:rPr>
+          <w:rFonts w:asciiTheme="majorHAnsi" w:hAnsiTheme="majorHAnsi" w:cstheme="majorHAnsi"/>
+          <w:sz w:val="20"/>
+          <w:szCs w:val="20"/>
+        </w:rPr>
+        <w:t xml:space="preserve">, especializado en </w:t>
+      </w:r>
+      <w:r>
+        <w:rPr>
+          <w:rFonts w:asciiTheme="majorHAnsi" w:hAnsiTheme="majorHAnsi" w:cstheme="majorHAnsi"/>
+          <w:sz w:val="20"/>
+          <w:szCs w:val="20"/>
+        </w:rPr>
+        <w:t xml:space="preserve">el desarrollo de aplicaciones y agentes inteligentes, </w:t>
+      </w:r>
+      <w:r>
+        <w:rPr>
+          <w:rFonts w:asciiTheme="majorHAnsi" w:hAnsiTheme="majorHAnsi" w:cstheme="majorHAnsi"/>
+          <w:sz w:val="20"/>
+          <w:szCs w:val="20"/>
+        </w:rPr>
+        <w:t>integrando IA y herramientas como</w:t>
+      </w:r>
+      <w:r>
+        <w:rPr>
+          <w:rFonts w:asciiTheme="majorHAnsi" w:hAnsiTheme="majorHAnsi" w:cstheme="majorHAnsi"/>
+          <w:sz w:val="20"/>
+          <w:szCs w:val="20"/>
+        </w:rPr>
+        <w:t xml:space="preserve"> </w:t>
+      </w:r>
       <w:r>
         <w:rPr>
           <w:rStyle w:val="Fuerte"/>
@@ -128,9 +128,8 @@
           <w:sz w:val="20"/>
           <w:szCs w:val="20"/>
         </w:rPr>
-        <w:t>Developer</w:t>
-      </w:r>
-      <w:proofErr w:type="spellEnd"/>
+        <w:t xml:space="preserve">Claude, </w:t>
+      </w:r>
       <w:r>
         <w:rPr>
           <w:rStyle w:val="Fuerte"/>
@@ -138,39 +137,7 @@
           <w:sz w:val="20"/>
           <w:szCs w:val="20"/>
         </w:rPr>
-        <w:t xml:space="preserve"> &amp; GenAI</w:t>
-      </w:r>
-      <w:r>
-        <w:rPr>
-          <w:rFonts w:asciiTheme="majorHAnsi" w:hAnsiTheme="majorHAnsi" w:cstheme="majorHAnsi"/>
-          <w:sz w:val="20"/>
-          <w:szCs w:val="20"/>
-        </w:rPr>
-        <w:t xml:space="preserve">, especializado en </w:t>
-      </w:r>
-      <w:r>
-        <w:rPr>
-          <w:rFonts w:asciiTheme="majorHAnsi" w:hAnsiTheme="majorHAnsi" w:cstheme="majorHAnsi"/>
-          <w:sz w:val="20"/>
-          <w:szCs w:val="20"/>
-        </w:rPr>
-        <w:t xml:space="preserve">el desarrollo de aplicaciones y agentes inteligentes, </w:t>
-      </w:r>
-      <w:r>
-        <w:rPr>
-          <w:rFonts w:asciiTheme="majorHAnsi" w:hAnsiTheme="majorHAnsi" w:cstheme="majorHAnsi"/>
-          <w:sz w:val="20"/>
-          <w:szCs w:val="20"/>
-        </w:rPr>
-        <w:t>integrando IA y herramientas como</w:t>
-      </w:r>
-      <w:r>
-        <w:rPr>
-          <w:rFonts w:asciiTheme="majorHAnsi" w:hAnsiTheme="majorHAnsi" w:cstheme="majorHAnsi"/>
-          <w:sz w:val="20"/>
-          <w:szCs w:val="20"/>
-        </w:rPr>
-        <w:t xml:space="preserve"> </w:t>
+        <w:t xml:space="preserve">Codex y </w:t>
       </w:r>
       <w:r>
         <w:rPr>
@@ -179,28 +146,8 @@
           <w:sz w:val="20"/>
           <w:szCs w:val="20"/>
         </w:rPr>
-        <w:t xml:space="preserve">Claude, </w:t>
-      </w:r>
-      <w:r>
-        <w:rPr>
-          <w:rStyle w:val="Fuerte"/>
-          <w:rFonts w:asciiTheme="majorHAnsi" w:hAnsiTheme="majorHAnsi" w:cstheme="majorHAnsi"/>
-          <w:sz w:val="20"/>
-          <w:szCs w:val="20"/>
-        </w:rPr>
-        <w:t xml:space="preserve">Codex y </w:t>
-      </w:r>
-      <w:proofErr w:type="spellStart"/>
-      <w:r>
-        <w:rPr>
-          <w:rStyle w:val="Fuerte"/>
-          <w:rFonts w:asciiTheme="majorHAnsi" w:hAnsiTheme="majorHAnsi" w:cstheme="majorHAnsi"/>
-          <w:sz w:val="20"/>
-          <w:szCs w:val="20"/>
-        </w:rPr>
         <w:t>Antigravity</w:t>
       </w:r>
-      <w:proofErr w:type="spellEnd"/>
       <w:r>
         <w:rPr>
           <w:rStyle w:val="Fuerte"/>
@@ -232,7 +179,6 @@
         </w:rPr>
         <w:t xml:space="preserve">normas </w:t>
       </w:r>
-      <w:proofErr w:type="spellStart"/>
       <w:r>
         <w:rPr>
           <w:rStyle w:val="Fuerte"/>
@@ -242,7 +188,6 @@
         </w:rPr>
         <w:t>Spec-Driven</w:t>
       </w:r>
-      <w:proofErr w:type="spellEnd"/>
       <w:r>
         <w:rPr>
           <w:rFonts w:asciiTheme="majorHAnsi" w:hAnsiTheme="majorHAnsi" w:cstheme="majorHAnsi"/>
@@ -385,7 +330,6 @@
         </w:rPr>
         <w:t xml:space="preserve">Gestiono </w:t>
       </w:r>
-      <w:proofErr w:type="spellStart"/>
       <w:r>
         <w:rPr>
           <w:rFonts w:asciiTheme="majorHAnsi" w:hAnsiTheme="majorHAnsi" w:cstheme="majorHAnsi"/>
@@ -397,7 +341,6 @@
         </w:rPr>
         <w:t>end-to-end</w:t>
       </w:r>
-      <w:proofErr w:type="spellEnd"/>
       <w:r>
         <w:rPr>
           <w:rFonts w:asciiTheme="majorHAnsi" w:hAnsiTheme="majorHAnsi" w:cstheme="majorHAnsi"/>
@@ -505,27 +448,7 @@
           <w:szCs w:val="20"/>
           <w:lang w:val="es-ES"/>
         </w:rPr>
-        <w:t xml:space="preserve">Desarrollo de agentes IA, integrados con aplicaciones, </w:t>
-      </w:r>
-      <w:proofErr w:type="spellStart"/>
-      <w:r>
-        <w:rPr>
-          <w:rFonts w:asciiTheme="majorHAnsi" w:hAnsiTheme="majorHAnsi" w:cstheme="majorHAnsi"/>
-          <w:sz w:val="20"/>
-          <w:szCs w:val="20"/>
-          <w:lang w:val="es-ES"/>
-        </w:rPr>
-        <w:t>APIs</w:t>
-      </w:r>
-      <w:proofErr w:type="spellEnd"/>
-      <w:r>
-        <w:rPr>
-          <w:rFonts w:asciiTheme="majorHAnsi" w:hAnsiTheme="majorHAnsi" w:cstheme="majorHAnsi"/>
-          <w:sz w:val="20"/>
-          <w:szCs w:val="20"/>
-          <w:lang w:val="es-ES"/>
-        </w:rPr>
-        <w:t xml:space="preserve">, bases de datos y procesos internos mediante </w:t>
+        <w:t xml:space="preserve">Desarrollo de agentes IA, integrados con aplicaciones, APIs, bases de datos y procesos internos mediante </w:t>
       </w:r>
       <w:r>
         <w:rPr>
@@ -587,7 +510,6 @@
         </w:rPr>
         <w:t xml:space="preserve">Node.js, </w:t>
       </w:r>
-      <w:proofErr w:type="spellStart"/>
       <w:r>
         <w:rPr>
           <w:rFonts w:asciiTheme="majorHAnsi" w:hAnsiTheme="majorHAnsi" w:cstheme="majorHAnsi"/>
@@ -596,9 +518,8 @@
           <w:sz w:val="20"/>
           <w:szCs w:val="20"/>
         </w:rPr>
-        <w:t>TypeScript</w:t>
-      </w:r>
-      <w:proofErr w:type="spellEnd"/>
+        <w:t xml:space="preserve">TypeScript, </w:t>
+      </w:r>
       <w:r>
         <w:rPr>
           <w:rFonts w:asciiTheme="majorHAnsi" w:hAnsiTheme="majorHAnsi" w:cstheme="majorHAnsi"/>
@@ -607,7 +528,7 @@
           <w:sz w:val="20"/>
           <w:szCs w:val="20"/>
         </w:rPr>
-        <w:t xml:space="preserve">, </w:t>
+        <w:t xml:space="preserve">Python, React, </w:t>
       </w:r>
       <w:r>
         <w:rPr>
@@ -617,9 +538,8 @@
           <w:sz w:val="20"/>
           <w:szCs w:val="20"/>
         </w:rPr>
-        <w:t xml:space="preserve">Python, </w:t>
-      </w:r>
-      <w:proofErr w:type="spellStart"/>
+        <w:t xml:space="preserve">Vue, </w:t>
+      </w:r>
       <w:r>
         <w:rPr>
           <w:rFonts w:asciiTheme="majorHAnsi" w:hAnsiTheme="majorHAnsi" w:cstheme="majorHAnsi"/>
@@ -628,9 +548,8 @@
           <w:sz w:val="20"/>
           <w:szCs w:val="20"/>
         </w:rPr>
-        <w:t>React</w:t>
-      </w:r>
-      <w:proofErr w:type="spellEnd"/>
+        <w:t xml:space="preserve">Go, </w:t>
+      </w:r>
       <w:r>
         <w:rPr>
           <w:rFonts w:asciiTheme="majorHAnsi" w:hAnsiTheme="majorHAnsi" w:cstheme="majorHAnsi"/>
@@ -639,7 +558,7 @@
           <w:sz w:val="20"/>
           <w:szCs w:val="20"/>
         </w:rPr>
-        <w:t xml:space="preserve">, </w:t>
+        <w:t xml:space="preserve">PHP, </w:t>
       </w:r>
       <w:r>
         <w:rPr>
@@ -649,9 +568,8 @@
           <w:sz w:val="20"/>
           <w:szCs w:val="20"/>
         </w:rPr>
-        <w:t xml:space="preserve">Vue, </w:t>
-      </w:r>
-      <w:proofErr w:type="spellStart"/>
+        <w:t>MySQL</w:t>
+      </w:r>
       <w:r>
         <w:rPr>
           <w:rFonts w:asciiTheme="majorHAnsi" w:hAnsiTheme="majorHAnsi" w:cstheme="majorHAnsi"/>
@@ -660,9 +578,8 @@
           <w:sz w:val="20"/>
           <w:szCs w:val="20"/>
         </w:rPr>
-        <w:t>Go</w:t>
-      </w:r>
-      <w:proofErr w:type="spellEnd"/>
+        <w:t xml:space="preserve">, MCP, </w:t>
+      </w:r>
       <w:r>
         <w:rPr>
           <w:rFonts w:asciiTheme="majorHAnsi" w:hAnsiTheme="majorHAnsi" w:cstheme="majorHAnsi"/>
@@ -671,7 +588,7 @@
           <w:sz w:val="20"/>
           <w:szCs w:val="20"/>
         </w:rPr>
-        <w:t xml:space="preserve">, </w:t>
+        <w:t xml:space="preserve">Claude, Antigravity, </w:t>
       </w:r>
       <w:r>
         <w:rPr>
@@ -681,106 +598,44 @@
           <w:sz w:val="20"/>
           <w:szCs w:val="20"/>
         </w:rPr>
-        <w:t xml:space="preserve">PHP, </w:t>
-      </w:r>
+        <w:t>Codex</w:t>
+      </w:r>
+      <w:r>
+        <w:rPr>
+          <w:rFonts w:asciiTheme="majorHAnsi" w:hAnsiTheme="majorHAnsi" w:cstheme="majorHAnsi"/>
+          <w:sz w:val="20"/>
+          <w:szCs w:val="20"/>
+        </w:rPr>
+        <w:t>)</w:t>
+      </w:r>
+    </w:p>
+    <w:p>
+      <w:pPr>
+        <w:rPr>
+          <w:rFonts w:asciiTheme="majorHAnsi" w:hAnsiTheme="majorHAnsi" w:cstheme="majorHAnsi"/>
+        </w:rPr>
+      </w:pPr>
       <w:r>
         <w:rPr>
           <w:rFonts w:asciiTheme="majorHAnsi" w:hAnsiTheme="majorHAnsi" w:cstheme="majorHAnsi"/>
           <w:b/>
           <w:bCs/>
-          <w:sz w:val="20"/>
-          <w:szCs w:val="20"/>
-        </w:rPr>
-        <w:t>MySQL</w:t>
+        </w:rPr>
+        <w:t xml:space="preserve">Full Stack &amp; </w:t>
       </w:r>
       <w:r>
         <w:rPr>
           <w:rFonts w:asciiTheme="majorHAnsi" w:hAnsiTheme="majorHAnsi" w:cstheme="majorHAnsi"/>
           <w:b/>
           <w:bCs/>
-          <w:sz w:val="20"/>
-          <w:szCs w:val="20"/>
-        </w:rPr>
-        <w:t xml:space="preserve">, MCP, </w:t>
+        </w:rPr>
+        <w:t>Web</w:t>
       </w:r>
       <w:r>
         <w:rPr>
           <w:rFonts w:asciiTheme="majorHAnsi" w:hAnsiTheme="majorHAnsi" w:cstheme="majorHAnsi"/>
           <w:b/>
           <w:bCs/>
-          <w:sz w:val="20"/>
-          <w:szCs w:val="20"/>
-        </w:rPr>
-        <w:t xml:space="preserve">Claude, </w:t>
-      </w:r>
-      <w:proofErr w:type="spellStart"/>
-      <w:r>
-        <w:rPr>
-          <w:rFonts w:asciiTheme="majorHAnsi" w:hAnsiTheme="majorHAnsi" w:cstheme="majorHAnsi"/>
-          <w:b/>
-          <w:bCs/>
-          <w:sz w:val="20"/>
-          <w:szCs w:val="20"/>
-        </w:rPr>
-        <w:t>Antigravity</w:t>
-      </w:r>
-      <w:proofErr w:type="spellEnd"/>
-      <w:r>
-        <w:rPr>
-          <w:rFonts w:asciiTheme="majorHAnsi" w:hAnsiTheme="majorHAnsi" w:cstheme="majorHAnsi"/>
-          <w:b/>
-          <w:bCs/>
-          <w:sz w:val="20"/>
-          <w:szCs w:val="20"/>
-        </w:rPr>
-        <w:t xml:space="preserve">, </w:t>
-      </w:r>
-      <w:r>
-        <w:rPr>
-          <w:rFonts w:asciiTheme="majorHAnsi" w:hAnsiTheme="majorHAnsi" w:cstheme="majorHAnsi"/>
-          <w:b/>
-          <w:bCs/>
-          <w:sz w:val="20"/>
-          <w:szCs w:val="20"/>
-        </w:rPr>
-        <w:t>Codex</w:t>
-      </w:r>
-      <w:r>
-        <w:rPr>
-          <w:rFonts w:asciiTheme="majorHAnsi" w:hAnsiTheme="majorHAnsi" w:cstheme="majorHAnsi"/>
-          <w:sz w:val="20"/>
-          <w:szCs w:val="20"/>
-        </w:rPr>
-        <w:t>)</w:t>
-      </w:r>
-    </w:p>
-    <w:p>
-      <w:pPr>
-        <w:rPr>
-          <w:rFonts w:asciiTheme="majorHAnsi" w:hAnsiTheme="majorHAnsi" w:cstheme="majorHAnsi"/>
-        </w:rPr>
-      </w:pPr>
-      <w:r>
-        <w:rPr>
-          <w:rFonts w:asciiTheme="majorHAnsi" w:hAnsiTheme="majorHAnsi" w:cstheme="majorHAnsi"/>
-          <w:b/>
-          <w:bCs/>
-        </w:rPr>
-        <w:t xml:space="preserve">Full Stack &amp; </w:t>
-      </w:r>
-      <w:r>
-        <w:rPr>
-          <w:rFonts w:asciiTheme="majorHAnsi" w:hAnsiTheme="majorHAnsi" w:cstheme="majorHAnsi"/>
-          <w:b/>
-          <w:bCs/>
-        </w:rPr>
-        <w:t>Web</w:t>
-      </w:r>
-      <w:r>
-        <w:rPr>
-          <w:rFonts w:asciiTheme="majorHAnsi" w:hAnsiTheme="majorHAnsi" w:cstheme="majorHAnsi"/>
-          <w:b/>
-          <w:bCs/>
         </w:rPr>
         <w:t xml:space="preserve"> Manager</w:t>
       </w:r>
@@ -788,21 +643,7 @@
         <w:rPr>
           <w:rFonts w:asciiTheme="majorHAnsi" w:hAnsiTheme="majorHAnsi" w:cstheme="majorHAnsi"/>
         </w:rPr>
-        <w:t xml:space="preserve"> | </w:t>
-      </w:r>
-      <w:proofErr w:type="spellStart"/>
-      <w:r>
-        <w:rPr>
-          <w:rFonts w:asciiTheme="majorHAnsi" w:hAnsiTheme="majorHAnsi" w:cstheme="majorHAnsi"/>
-        </w:rPr>
-        <w:t>Vapemarkt</w:t>
-      </w:r>
-      <w:proofErr w:type="spellEnd"/>
-      <w:r>
-        <w:rPr>
-          <w:rFonts w:asciiTheme="majorHAnsi" w:hAnsiTheme="majorHAnsi" w:cstheme="majorHAnsi"/>
-        </w:rPr>
-        <w:t xml:space="preserve"> | 2023–2025</w:t>
+        <w:t xml:space="preserve"> | Vapemarkt | 2023–2025</w:t>
       </w:r>
     </w:p>
     <w:p>
@@ -824,43 +665,7 @@
           <w:sz w:val="20"/>
           <w:szCs w:val="20"/>
         </w:rPr>
-        <w:t xml:space="preserve">Desarrollo web con PHP, </w:t>
-      </w:r>
-      <w:proofErr w:type="spellStart"/>
-      <w:r>
-        <w:rPr>
-          <w:rFonts w:asciiTheme="majorHAnsi" w:hAnsiTheme="majorHAnsi" w:cstheme="majorHAnsi"/>
-          <w:sz w:val="20"/>
-          <w:szCs w:val="20"/>
-        </w:rPr>
-        <w:t>TypeScript</w:t>
-      </w:r>
-      <w:proofErr w:type="spellEnd"/>
-      <w:r>
-        <w:rPr>
-          <w:rFonts w:asciiTheme="majorHAnsi" w:hAnsiTheme="majorHAnsi" w:cstheme="majorHAnsi"/>
-          <w:sz w:val="20"/>
-          <w:szCs w:val="20"/>
-        </w:rPr>
-        <w:t xml:space="preserve">, Node.js, Python y </w:t>
-      </w:r>
-      <w:proofErr w:type="spellStart"/>
-      <w:r>
-        <w:rPr>
-          <w:rFonts w:asciiTheme="majorHAnsi" w:hAnsiTheme="majorHAnsi" w:cstheme="majorHAnsi"/>
-          <w:sz w:val="20"/>
-          <w:szCs w:val="20"/>
-        </w:rPr>
-        <w:t>React</w:t>
-      </w:r>
-      <w:proofErr w:type="spellEnd"/>
-      <w:r>
-        <w:rPr>
-          <w:rFonts w:asciiTheme="majorHAnsi" w:hAnsiTheme="majorHAnsi" w:cstheme="majorHAnsi"/>
-          <w:sz w:val="20"/>
-          <w:szCs w:val="20"/>
-        </w:rPr>
-        <w:t xml:space="preserve">, integrando </w:t>
+        <w:t xml:space="preserve">Desarrollo web con PHP, TypeScript, Node.js, Python y React, integrando </w:t>
       </w:r>
       <w:r>
         <w:rPr>
@@ -876,25 +681,7 @@
           <w:sz w:val="20"/>
           <w:szCs w:val="20"/>
         </w:rPr>
-        <w:t xml:space="preserve">, </w:t>
-      </w:r>
-      <w:proofErr w:type="spellStart"/>
-      <w:r>
-        <w:rPr>
-          <w:rFonts w:asciiTheme="majorHAnsi" w:hAnsiTheme="majorHAnsi" w:cstheme="majorHAnsi"/>
-          <w:sz w:val="20"/>
-          <w:szCs w:val="20"/>
-        </w:rPr>
-        <w:t>APIs</w:t>
-      </w:r>
-      <w:proofErr w:type="spellEnd"/>
-      <w:r>
-        <w:rPr>
-          <w:rFonts w:asciiTheme="majorHAnsi" w:hAnsiTheme="majorHAnsi" w:cstheme="majorHAnsi"/>
-          <w:sz w:val="20"/>
-          <w:szCs w:val="20"/>
-        </w:rPr>
-        <w:t xml:space="preserve"> y servicios de terceros.</w:t>
+        <w:t>, APIs y servicios de terceros.</w:t>
       </w:r>
     </w:p>
     <w:p>
@@ -948,25 +735,7 @@
           <w:sz w:val="20"/>
           <w:szCs w:val="20"/>
         </w:rPr>
-        <w:t xml:space="preserve">WordPress, Shopify y </w:t>
-      </w:r>
-      <w:proofErr w:type="spellStart"/>
-      <w:r>
-        <w:rPr>
-          <w:rFonts w:asciiTheme="majorHAnsi" w:hAnsiTheme="majorHAnsi" w:cstheme="majorHAnsi"/>
-          <w:sz w:val="20"/>
-          <w:szCs w:val="20"/>
-        </w:rPr>
-        <w:t>PrestaShop</w:t>
-      </w:r>
-      <w:proofErr w:type="spellEnd"/>
-      <w:r>
-        <w:rPr>
-          <w:rFonts w:asciiTheme="majorHAnsi" w:hAnsiTheme="majorHAnsi" w:cstheme="majorHAnsi"/>
-          <w:sz w:val="20"/>
-          <w:szCs w:val="20"/>
-        </w:rPr>
-        <w:t>, incluyendo integraciones específicas.</w:t>
+        <w:t>WordPress, Shopify y PrestaShop, incluyendo integraciones específicas.</w:t>
       </w:r>
     </w:p>
     <w:p>
@@ -1041,21 +810,7 @@
         <w:rPr>
           <w:rFonts w:asciiTheme="majorHAnsi" w:hAnsiTheme="majorHAnsi" w:cstheme="majorHAnsi"/>
         </w:rPr>
-        <w:t xml:space="preserve"> | Web Virtual </w:t>
-      </w:r>
-      <w:proofErr w:type="spellStart"/>
-      <w:r>
-        <w:rPr>
-          <w:rFonts w:asciiTheme="majorHAnsi" w:hAnsiTheme="majorHAnsi" w:cstheme="majorHAnsi"/>
-        </w:rPr>
-        <w:t>Design</w:t>
-      </w:r>
-      <w:proofErr w:type="spellEnd"/>
-      <w:r>
-        <w:rPr>
-          <w:rFonts w:asciiTheme="majorHAnsi" w:hAnsiTheme="majorHAnsi" w:cstheme="majorHAnsi"/>
-        </w:rPr>
-        <w:t xml:space="preserve"> | 2008–2023</w:t>
+        <w:t xml:space="preserve"> | Web Virtual Design | 2008–2023</w:t>
       </w:r>
     </w:p>
     <w:p>
@@ -1123,18 +878,8 @@
           <w:sz w:val="20"/>
           <w:szCs w:val="20"/>
         </w:rPr>
-        <w:t xml:space="preserve">, </w:t>
-      </w:r>
-      <w:proofErr w:type="spellStart"/>
-      <w:r>
-        <w:rPr>
-          <w:rFonts w:asciiTheme="majorHAnsi" w:hAnsiTheme="majorHAnsi" w:cstheme="majorHAnsi"/>
-          <w:sz w:val="20"/>
-          <w:szCs w:val="20"/>
-        </w:rPr>
-        <w:t>APIs</w:t>
-      </w:r>
-      <w:proofErr w:type="spellEnd"/>
+        <w:t>, APIs</w:t>
+      </w:r>
       <w:r>
         <w:rPr>
           <w:rFonts w:asciiTheme="majorHAnsi" w:hAnsiTheme="majorHAnsi" w:cstheme="majorHAnsi"/>
@@ -1219,25 +964,7 @@
           <w:sz w:val="20"/>
           <w:szCs w:val="20"/>
         </w:rPr>
-        <w:t xml:space="preserve">con PHP/Laravel, JavaScript y </w:t>
-      </w:r>
-      <w:proofErr w:type="spellStart"/>
-      <w:r>
-        <w:rPr>
-          <w:rFonts w:asciiTheme="majorHAnsi" w:hAnsiTheme="majorHAnsi" w:cstheme="majorHAnsi"/>
-          <w:sz w:val="20"/>
-          <w:szCs w:val="20"/>
-        </w:rPr>
-        <w:t>React</w:t>
-      </w:r>
-      <w:proofErr w:type="spellEnd"/>
-      <w:r>
-        <w:rPr>
-          <w:rFonts w:asciiTheme="majorHAnsi" w:hAnsiTheme="majorHAnsi" w:cstheme="majorHAnsi"/>
-          <w:sz w:val="20"/>
-          <w:szCs w:val="20"/>
-        </w:rPr>
-        <w:t xml:space="preserve"> para clientes </w:t>
+        <w:t xml:space="preserve">con PHP/Laravel, JavaScript y React para clientes </w:t>
       </w:r>
       <w:r>
         <w:rPr>
@@ -1254,34 +981,14 @@
           <w:rFonts w:asciiTheme="majorHAnsi" w:hAnsiTheme="majorHAnsi" w:cstheme="majorHAnsi"/>
         </w:rPr>
       </w:pPr>
-      <w:proofErr w:type="spellStart"/>
       <w:r>
         <w:rPr>
           <w:rFonts w:asciiTheme="majorHAnsi" w:hAnsiTheme="majorHAnsi" w:cstheme="majorHAnsi"/>
           <w:b/>
           <w:bCs/>
         </w:rPr>
-        <w:t>Own</w:t>
-      </w:r>
-      <w:proofErr w:type="spellEnd"/>
-      <w:r>
-        <w:rPr>
-          <w:rFonts w:asciiTheme="majorHAnsi" w:hAnsiTheme="majorHAnsi" w:cstheme="majorHAnsi"/>
-          <w:b/>
-          <w:bCs/>
-        </w:rPr>
-        <w:t xml:space="preserve"> </w:t>
-      </w:r>
-      <w:proofErr w:type="spellStart"/>
-      <w:r>
-        <w:rPr>
-          <w:rFonts w:asciiTheme="majorHAnsi" w:hAnsiTheme="majorHAnsi" w:cstheme="majorHAnsi"/>
-          <w:b/>
-          <w:bCs/>
-        </w:rPr>
-        <w:t>Businesses</w:t>
-      </w:r>
-      <w:proofErr w:type="spellEnd"/>
+        <w:t>Own Businesses</w:t>
+      </w:r>
       <w:r>
         <w:rPr>
           <w:rFonts w:asciiTheme="majorHAnsi" w:hAnsiTheme="majorHAnsi" w:cstheme="majorHAnsi"/>
@@ -1310,25 +1017,7 @@
           <w:sz w:val="20"/>
           <w:szCs w:val="20"/>
         </w:rPr>
-        <w:t>Creación y gestión de agencia de desarrollo web y negocios e-</w:t>
-      </w:r>
-      <w:proofErr w:type="spellStart"/>
-      <w:r>
-        <w:rPr>
-          <w:rFonts w:asciiTheme="majorHAnsi" w:hAnsiTheme="majorHAnsi" w:cstheme="majorHAnsi"/>
-          <w:sz w:val="20"/>
-          <w:szCs w:val="20"/>
-        </w:rPr>
-        <w:t>commerce</w:t>
-      </w:r>
-      <w:proofErr w:type="spellEnd"/>
-      <w:r>
-        <w:rPr>
-          <w:rFonts w:asciiTheme="majorHAnsi" w:hAnsiTheme="majorHAnsi" w:cstheme="majorHAnsi"/>
-          <w:sz w:val="20"/>
-          <w:szCs w:val="20"/>
-        </w:rPr>
-        <w:t>.</w:t>
+        <w:t>Creación y gestión de agencia de desarrollo web y negocios e-commerce.</w:t>
       </w:r>
     </w:p>
     <w:p>
@@ -1345,25 +1034,7 @@
           <w:b/>
           <w:bCs/>
         </w:rPr>
-        <w:t xml:space="preserve">IT </w:t>
-      </w:r>
-      <w:proofErr w:type="spellStart"/>
-      <w:r>
-        <w:rPr>
-          <w:rFonts w:asciiTheme="majorHAnsi" w:hAnsiTheme="majorHAnsi" w:cstheme="majorHAnsi"/>
-          <w:b/>
-          <w:bCs/>
-        </w:rPr>
-        <w:t>Infrastructure</w:t>
-      </w:r>
-      <w:proofErr w:type="spellEnd"/>
-      <w:r>
-        <w:rPr>
-          <w:rFonts w:asciiTheme="majorHAnsi" w:hAnsiTheme="majorHAnsi" w:cstheme="majorHAnsi"/>
-          <w:b/>
-          <w:bCs/>
-        </w:rPr>
-        <w:t xml:space="preserve"> Manager</w:t>
+        <w:t>IT Infrastructure Manager</w:t>
       </w:r>
       <w:r>
         <w:rPr>
@@ -1490,23 +1161,13 @@
           <w:rFonts w:asciiTheme="majorHAnsi" w:hAnsiTheme="majorHAnsi" w:cstheme="majorHAnsi"/>
         </w:rPr>
       </w:pPr>
-      <w:proofErr w:type="spellStart"/>
       <w:r>
         <w:rPr>
           <w:rFonts w:asciiTheme="majorHAnsi" w:hAnsiTheme="majorHAnsi" w:cstheme="majorHAnsi"/>
           <w:b/>
           <w:bCs/>
         </w:rPr>
-        <w:t>Cybersecurity</w:t>
-      </w:r>
-      <w:proofErr w:type="spellEnd"/>
-      <w:r>
-        <w:rPr>
-          <w:rFonts w:asciiTheme="majorHAnsi" w:hAnsiTheme="majorHAnsi" w:cstheme="majorHAnsi"/>
-          <w:b/>
-          <w:bCs/>
-        </w:rPr>
-        <w:t xml:space="preserve"> Manager</w:t>
+        <w:t>Cybersecurity Manager</w:t>
       </w:r>
       <w:r>
         <w:rPr>
@@ -1575,53 +1236,19 @@
           <w:rFonts w:asciiTheme="majorHAnsi" w:hAnsiTheme="majorHAnsi" w:cstheme="majorHAnsi"/>
         </w:rPr>
       </w:pPr>
-      <w:proofErr w:type="spellStart"/>
       <w:r>
         <w:rPr>
           <w:rFonts w:asciiTheme="majorHAnsi" w:hAnsiTheme="majorHAnsi" w:cstheme="majorHAnsi"/>
           <w:b/>
           <w:bCs/>
         </w:rPr>
-        <w:t>System</w:t>
-      </w:r>
-      <w:proofErr w:type="spellEnd"/>
-      <w:r>
-        <w:rPr>
-          <w:rFonts w:asciiTheme="majorHAnsi" w:hAnsiTheme="majorHAnsi" w:cstheme="majorHAnsi"/>
-          <w:b/>
-          <w:bCs/>
-        </w:rPr>
-        <w:t xml:space="preserve"> </w:t>
-      </w:r>
-      <w:proofErr w:type="spellStart"/>
-      <w:r>
-        <w:rPr>
-          <w:rFonts w:asciiTheme="majorHAnsi" w:hAnsiTheme="majorHAnsi" w:cstheme="majorHAnsi"/>
-          <w:b/>
-          <w:bCs/>
-        </w:rPr>
-        <w:t>Administrator</w:t>
-      </w:r>
-      <w:proofErr w:type="spellEnd"/>
-      <w:r>
-        <w:rPr>
-          <w:rFonts w:asciiTheme="majorHAnsi" w:hAnsiTheme="majorHAnsi" w:cstheme="majorHAnsi"/>
-        </w:rPr>
-        <w:t xml:space="preserve"> | </w:t>
-      </w:r>
-      <w:proofErr w:type="spellStart"/>
-      <w:r>
-        <w:rPr>
-          <w:rFonts w:asciiTheme="majorHAnsi" w:hAnsiTheme="majorHAnsi" w:cstheme="majorHAnsi"/>
-        </w:rPr>
-        <w:t>Transiciel</w:t>
-      </w:r>
-      <w:proofErr w:type="spellEnd"/>
-      <w:r>
-        <w:rPr>
-          <w:rFonts w:asciiTheme="majorHAnsi" w:hAnsiTheme="majorHAnsi" w:cstheme="majorHAnsi"/>
-        </w:rPr>
-        <w:t xml:space="preserve"> | 1998–2000</w:t>
+        <w:t>System Administrator</w:t>
+      </w:r>
+      <w:r>
+        <w:rPr>
+          <w:rFonts w:asciiTheme="majorHAnsi" w:hAnsiTheme="majorHAnsi" w:cstheme="majorHAnsi"/>
+        </w:rPr>
+        <w:t xml:space="preserve"> | Transiciel | 1998–2000</w:t>
       </w:r>
     </w:p>
     <w:p>
@@ -1663,21 +1290,7 @@
         <w:rPr>
           <w:rFonts w:asciiTheme="majorHAnsi" w:hAnsiTheme="majorHAnsi" w:cstheme="majorHAnsi"/>
         </w:rPr>
-        <w:t xml:space="preserve">, BBVA, Telefónica, </w:t>
-      </w:r>
-      <w:proofErr w:type="spellStart"/>
-      <w:r>
-        <w:rPr>
-          <w:rFonts w:asciiTheme="majorHAnsi" w:hAnsiTheme="majorHAnsi" w:cstheme="majorHAnsi"/>
-        </w:rPr>
-        <w:t>etc</w:t>
-      </w:r>
-      <w:proofErr w:type="spellEnd"/>
-      <w:r>
-        <w:rPr>
-          <w:rFonts w:asciiTheme="majorHAnsi" w:hAnsiTheme="majorHAnsi" w:cstheme="majorHAnsi"/>
-        </w:rPr>
-        <w:t>)</w:t>
+        <w:t>, BBVA, Telefónica, etc)</w:t>
       </w:r>
       <w:r>
         <w:rPr>
@@ -1730,20 +1343,7 @@
           <w:szCs w:val="20"/>
           <w:lang w:val="es-ES"/>
         </w:rPr>
-        <w:t xml:space="preserve">Máster en Inteligencia Artificial e </w:t>
-      </w:r>
-      <w:proofErr w:type="gramStart"/>
-      <w:r>
-        <w:rPr>
-          <w:rFonts w:ascii="Calibri Light" w:eastAsia="SimSun" w:hAnsi="Calibri Light" w:cs="Calibri Light"/>
-          <w:b/>
-          <w:bCs/>
-          <w:color w:val="000000"/>
-          <w:sz w:val="20"/>
-          <w:szCs w:val="20"/>
-          <w:lang w:val="es-ES"/>
-        </w:rPr>
-        <w:t xml:space="preserve">Innovación </w:t>
+        <w:t xml:space="preserve">Máster en Inteligencia Artificial e Innovación </w:t>
       </w:r>
       <w:r>
         <w:rPr>
@@ -1753,20 +1353,8 @@
           <w:szCs w:val="20"/>
           <w:lang w:val="es-ES"/>
         </w:rPr>
-        <w:t xml:space="preserve"> -</w:t>
-      </w:r>
-      <w:proofErr w:type="gramEnd"/>
-      <w:r>
-        <w:rPr>
-          <w:rFonts w:ascii="Calibri Light" w:eastAsia="SimSun" w:hAnsi="Calibri Light" w:cs="Calibri Light"/>
-          <w:color w:val="000000"/>
-          <w:sz w:val="20"/>
-          <w:szCs w:val="20"/>
-          <w:lang w:val="es-ES"/>
-        </w:rPr>
-        <w:t xml:space="preserve"> </w:t>
-      </w:r>
-      <w:proofErr w:type="spellStart"/>
+        <w:t xml:space="preserve"> - </w:t>
+      </w:r>
       <w:r>
         <w:rPr>
           <w:rFonts w:ascii="Calibri Light" w:eastAsia="SimSun" w:hAnsi="Calibri Light" w:cs="Calibri Light"/>
@@ -1777,20 +1365,7 @@
           <w:szCs w:val="20"/>
           <w:lang w:val="es-ES"/>
         </w:rPr>
-        <w:t>Founderz</w:t>
-      </w:r>
-      <w:proofErr w:type="spellEnd"/>
-      <w:r>
-        <w:rPr>
-          <w:rFonts w:ascii="Calibri Light" w:eastAsia="SimSun" w:hAnsi="Calibri Light" w:cs="Calibri Light"/>
-          <w:i/>
-          <w:iCs/>
-          <w:color w:val="000000"/>
-          <w:sz w:val="20"/>
-          <w:szCs w:val="20"/>
-          <w:lang w:val="es-ES"/>
-        </w:rPr>
-        <w:t xml:space="preserve"> y Microsoft - en curso</w:t>
+        <w:t>Founderz y Microsoft - en curso</w:t>
       </w:r>
     </w:p>
     <w:p>
@@ -1829,7 +1404,6 @@
         </w:rPr>
         <w:t xml:space="preserve"> - </w:t>
       </w:r>
-      <w:proofErr w:type="spellStart"/>
       <w:r>
         <w:rPr>
           <w:rFonts w:ascii="Calibri Light" w:eastAsia="SimSun" w:hAnsi="Calibri Light" w:cs="Calibri Light"/>
@@ -1840,35 +1414,8 @@
           <w:szCs w:val="20"/>
           <w:lang w:val="es-ES"/>
         </w:rPr>
-        <w:t>Webpositer</w:t>
-      </w:r>
-      <w:proofErr w:type="spellEnd"/>
-      <w:r>
-        <w:rPr>
-          <w:rFonts w:ascii="Calibri Light" w:eastAsia="SimSun" w:hAnsi="Calibri Light" w:cs="Calibri Light"/>
-          <w:i/>
-          <w:iCs/>
-          <w:color w:val="000000"/>
-          <w:sz w:val="20"/>
-          <w:szCs w:val="20"/>
-          <w:lang w:val="es-ES"/>
-        </w:rPr>
-        <w:t xml:space="preserve"> </w:t>
-      </w:r>
-      <w:proofErr w:type="spellStart"/>
-      <w:r>
-        <w:rPr>
-          <w:rFonts w:ascii="Calibri Light" w:eastAsia="SimSun" w:hAnsi="Calibri Light" w:cs="Calibri Light"/>
-          <w:i/>
-          <w:iCs/>
-          <w:color w:val="000000"/>
-          <w:sz w:val="20"/>
-          <w:szCs w:val="20"/>
-          <w:lang w:val="es-ES"/>
-        </w:rPr>
-        <w:t>Academy</w:t>
-      </w:r>
-      <w:proofErr w:type="spellEnd"/>
+        <w:t>Webpositer Academy</w:t>
+      </w:r>
     </w:p>
     <w:p>
       <w:pPr>
@@ -1933,7 +1480,6 @@
           <w:lang w:val="es-ES"/>
         </w:rPr>
       </w:pPr>
-      <w:proofErr w:type="spellStart"/>
       <w:r>
         <w:rPr>
           <w:rFonts w:ascii="Calibri Light" w:eastAsia="SimSun" w:hAnsi="Calibri Light" w:cs="Calibri Light"/>
@@ -1944,98 +1490,7 @@
           <w:szCs w:val="20"/>
           <w:lang w:val="es-ES"/>
         </w:rPr>
-        <w:t>Frontend</w:t>
-      </w:r>
-      <w:proofErr w:type="spellEnd"/>
-      <w:r>
-        <w:rPr>
-          <w:rFonts w:ascii="Calibri Light" w:eastAsia="SimSun" w:hAnsi="Calibri Light" w:cs="Calibri Light"/>
-          <w:b/>
-          <w:bCs/>
-          <w:color w:val="000000"/>
-          <w:sz w:val="20"/>
-          <w:szCs w:val="20"/>
-          <w:lang w:val="es-ES"/>
-        </w:rPr>
-        <w:t xml:space="preserve"> con JavaScript </w:t>
-      </w:r>
-      <w:proofErr w:type="gramStart"/>
-      <w:r>
-        <w:rPr>
-          <w:rFonts w:ascii="Calibri Light" w:eastAsia="SimSun" w:hAnsi="Calibri Light" w:cs="Calibri Light"/>
-          <w:b/>
-          <w:bCs/>
-          <w:color w:val="000000"/>
-          <w:sz w:val="20"/>
-          <w:szCs w:val="20"/>
-          <w:lang w:val="es-ES"/>
-        </w:rPr>
-        <w:t>-  JavaScript</w:t>
-      </w:r>
-      <w:proofErr w:type="gramEnd"/>
-      <w:r>
-        <w:rPr>
-          <w:rFonts w:ascii="Calibri Light" w:eastAsia="SimSun" w:hAnsi="Calibri Light" w:cs="Calibri Light"/>
-          <w:b/>
-          <w:bCs/>
-          <w:color w:val="000000"/>
-          <w:sz w:val="20"/>
-          <w:szCs w:val="20"/>
-          <w:lang w:val="es-ES"/>
-        </w:rPr>
-        <w:t xml:space="preserve">, </w:t>
-      </w:r>
-      <w:proofErr w:type="spellStart"/>
-      <w:r>
-        <w:rPr>
-          <w:rFonts w:ascii="Calibri Light" w:eastAsia="SimSun" w:hAnsi="Calibri Light" w:cs="Calibri Light"/>
-          <w:b/>
-          <w:bCs/>
-          <w:color w:val="000000"/>
-          <w:sz w:val="20"/>
-          <w:szCs w:val="20"/>
-          <w:lang w:val="es-ES"/>
-        </w:rPr>
-        <w:t>TypeScript</w:t>
-      </w:r>
-      <w:proofErr w:type="spellEnd"/>
-      <w:r>
-        <w:rPr>
-          <w:rFonts w:ascii="Calibri Light" w:eastAsia="SimSun" w:hAnsi="Calibri Light" w:cs="Calibri Light"/>
-          <w:b/>
-          <w:bCs/>
-          <w:color w:val="000000"/>
-          <w:sz w:val="20"/>
-          <w:szCs w:val="20"/>
-          <w:lang w:val="es-ES"/>
-        </w:rPr>
-        <w:t xml:space="preserve">, </w:t>
-      </w:r>
-      <w:proofErr w:type="spellStart"/>
-      <w:r>
-        <w:rPr>
-          <w:rFonts w:ascii="Calibri Light" w:eastAsia="SimSun" w:hAnsi="Calibri Light" w:cs="Calibri Light"/>
-          <w:b/>
-          <w:bCs/>
-          <w:color w:val="000000"/>
-          <w:sz w:val="20"/>
-          <w:szCs w:val="20"/>
-          <w:lang w:val="es-ES"/>
-        </w:rPr>
-        <w:t>React</w:t>
-      </w:r>
-      <w:proofErr w:type="spellEnd"/>
-      <w:r>
-        <w:rPr>
-          <w:rFonts w:ascii="Calibri Light" w:eastAsia="SimSun" w:hAnsi="Calibri Light" w:cs="Calibri Light"/>
-          <w:b/>
-          <w:bCs/>
-          <w:color w:val="000000"/>
-          <w:sz w:val="20"/>
-          <w:szCs w:val="20"/>
-          <w:lang w:val="es-ES"/>
-        </w:rPr>
-        <w:t>, Angular y Vue.js</w:t>
+        <w:t>Frontend con JavaScript -  JavaScript, TypeScript, React, Angular y Vue.js</w:t>
       </w:r>
       <w:r>
         <w:rPr>
@@ -2047,22 +1502,8 @@
           <w:szCs w:val="20"/>
           <w:lang w:val="es-ES"/>
         </w:rPr>
-        <w:t xml:space="preserve"> - </w:t>
-      </w:r>
-      <w:proofErr w:type="spellStart"/>
-      <w:r>
-        <w:rPr>
-          <w:rFonts w:ascii="Calibri Light" w:eastAsia="SimSun" w:hAnsi="Calibri Light" w:cs="Calibri Light"/>
-          <w:i/>
-          <w:iCs/>
-          <w:color w:val="000000"/>
-          <w:sz w:val="20"/>
-          <w:szCs w:val="20"/>
-          <w:lang w:val="es-ES"/>
-        </w:rPr>
-        <w:t>EDteam</w:t>
-      </w:r>
-      <w:proofErr w:type="spellEnd"/>
+        <w:t xml:space="preserve"> - EDteam</w:t>
+      </w:r>
     </w:p>
     <w:p>
       <w:pPr>
@@ -2078,7 +1519,6 @@
           <w:lang w:val="es-ES"/>
         </w:rPr>
       </w:pPr>
-      <w:proofErr w:type="spellStart"/>
       <w:r>
         <w:rPr>
           <w:rFonts w:ascii="Calibri Light" w:eastAsia="SimSun" w:hAnsi="Calibri Light" w:cs="Calibri Light"/>
@@ -2089,9 +1529,20 @@
           <w:szCs w:val="20"/>
           <w:lang w:val="es-ES"/>
         </w:rPr>
-        <w:t>Backend</w:t>
-      </w:r>
-      <w:proofErr w:type="spellEnd"/>
+        <w:t xml:space="preserve">Backend con Python - Python, NodeJS, Django, Flask, PostgreSQL </w:t>
+      </w:r>
+      <w:r>
+        <w:rPr>
+          <w:rFonts w:ascii="Calibri Light" w:eastAsia="SimSun" w:hAnsi="Calibri Light" w:cs="Calibri Light"/>
+          <w:i/>
+          <w:iCs/>
+          <w:color w:val="000000"/>
+          <w:sz w:val="20"/>
+          <w:szCs w:val="20"/>
+          <w:lang w:val="es-ES"/>
+        </w:rPr>
+        <w:t xml:space="preserve">- </w:t>
+      </w:r>
       <w:r>
         <w:rPr>
           <w:rFonts w:ascii="Calibri Light" w:eastAsia="SimSun" w:hAnsi="Calibri Light" w:cs="Calibri Light"/>
@@ -2102,12 +1553,11 @@
           <w:szCs w:val="20"/>
           <w:lang w:val="es-ES"/>
         </w:rPr>
-        <w:t xml:space="preserve"> con Python - Python, </w:t>
-      </w:r>
-      <w:proofErr w:type="spellStart"/>
-      <w:r>
-        <w:rPr>
-          <w:rFonts w:ascii="Calibri Light" w:eastAsia="SimSun" w:hAnsi="Calibri Light" w:cs="Calibri Light"/>
+        <w:t xml:space="preserve">Backend con PHP - PHP, Laravel, </w:t>
+      </w:r>
+      <w:r>
+        <w:rPr>
+          <w:rFonts w:ascii="Calibri Light" w:eastAsia="SimSun" w:hAnsi="Calibri Light"/>
           <w:b/>
           <w:bCs/>
           <w:color w:val="000000"/>
@@ -2115,20 +1565,7 @@
           <w:szCs w:val="20"/>
           <w:lang w:val="es-ES"/>
         </w:rPr>
-        <w:t>NodeJS</w:t>
-      </w:r>
-      <w:proofErr w:type="spellEnd"/>
-      <w:r>
-        <w:rPr>
-          <w:rFonts w:ascii="Calibri Light" w:eastAsia="SimSun" w:hAnsi="Calibri Light" w:cs="Calibri Light"/>
-          <w:b/>
-          <w:bCs/>
-          <w:color w:val="000000"/>
-          <w:sz w:val="20"/>
-          <w:szCs w:val="20"/>
-          <w:lang w:val="es-ES"/>
-        </w:rPr>
-        <w:t xml:space="preserve">, Django, Flask, PostgreSQL </w:t>
+        <w:t>MySQL</w:t>
       </w:r>
       <w:r>
         <w:rPr>
@@ -2140,72 +1577,8 @@
           <w:szCs w:val="20"/>
           <w:lang w:val="es-ES"/>
         </w:rPr>
-        <w:t xml:space="preserve">- </w:t>
-      </w:r>
-      <w:proofErr w:type="spellStart"/>
-      <w:r>
-        <w:rPr>
-          <w:rFonts w:ascii="Calibri Light" w:eastAsia="SimSun" w:hAnsi="Calibri Light" w:cs="Calibri Light"/>
-          <w:b/>
-          <w:bCs/>
-          <w:color w:val="000000"/>
-          <w:sz w:val="20"/>
-          <w:szCs w:val="20"/>
-          <w:lang w:val="es-ES"/>
-        </w:rPr>
-        <w:t>Backend</w:t>
-      </w:r>
-      <w:proofErr w:type="spellEnd"/>
-      <w:r>
-        <w:rPr>
-          <w:rFonts w:ascii="Calibri Light" w:eastAsia="SimSun" w:hAnsi="Calibri Light" w:cs="Calibri Light"/>
-          <w:b/>
-          <w:bCs/>
-          <w:color w:val="000000"/>
-          <w:sz w:val="20"/>
-          <w:szCs w:val="20"/>
-          <w:lang w:val="es-ES"/>
-        </w:rPr>
-        <w:t xml:space="preserve"> con PHP - PHP, Laravel, </w:t>
-      </w:r>
-      <w:r>
-        <w:rPr>
-          <w:rFonts w:ascii="Calibri Light" w:eastAsia="SimSun" w:hAnsi="Calibri Light"/>
-          <w:b/>
-          <w:bCs/>
-          <w:color w:val="000000"/>
-          <w:sz w:val="20"/>
-          <w:szCs w:val="20"/>
-          <w:lang w:val="es-ES"/>
-        </w:rPr>
-        <w:t>MySQL</w:t>
-      </w:r>
-      <w:r>
-        <w:rPr>
-          <w:rFonts w:ascii="Calibri Light" w:eastAsia="SimSun" w:hAnsi="Calibri Light" w:cs="Calibri Light"/>
-          <w:i/>
-          <w:iCs/>
-          <w:color w:val="000000"/>
-          <w:sz w:val="20"/>
-          <w:szCs w:val="20"/>
-          <w:lang w:val="es-ES"/>
-        </w:rPr>
-        <w:t xml:space="preserve"> - </w:t>
-      </w:r>
-      <w:proofErr w:type="spellStart"/>
-      <w:r>
-        <w:rPr>
-          <w:rFonts w:ascii="Calibri Light" w:eastAsia="SimSun" w:hAnsi="Calibri Light" w:cs="Calibri Light"/>
-          <w:i/>
-          <w:iCs/>
-          <w:color w:val="000000"/>
-          <w:sz w:val="20"/>
-          <w:szCs w:val="20"/>
-          <w:lang w:val="es-ES"/>
-        </w:rPr>
-        <w:t>EDteam</w:t>
-      </w:r>
-      <w:proofErr w:type="spellEnd"/>
+        <w:t xml:space="preserve"> - EDteam</w:t>
+      </w:r>
     </w:p>
     <w:p>
       <w:pPr>
@@ -2221,7 +1594,6 @@
           <w:lang w:val="es-ES"/>
         </w:rPr>
       </w:pPr>
-      <w:proofErr w:type="spellStart"/>
       <w:r>
         <w:rPr>
           <w:rFonts w:ascii="Calibri Light" w:eastAsia="SimSun" w:hAnsi="Calibri Light"/>
@@ -2232,46 +1604,7 @@
           <w:szCs w:val="20"/>
           <w:lang w:val="es-ES"/>
         </w:rPr>
-        <w:t>Backend</w:t>
-      </w:r>
-      <w:proofErr w:type="spellEnd"/>
-      <w:r>
-        <w:rPr>
-          <w:rFonts w:ascii="Calibri Light" w:eastAsia="SimSun" w:hAnsi="Calibri Light"/>
-          <w:b/>
-          <w:bCs/>
-          <w:color w:val="000000"/>
-          <w:sz w:val="20"/>
-          <w:szCs w:val="20"/>
-          <w:lang w:val="es-ES"/>
-        </w:rPr>
-        <w:t xml:space="preserve"> con Java - Java, Spring Boot, </w:t>
-      </w:r>
-      <w:proofErr w:type="spellStart"/>
-      <w:r>
-        <w:rPr>
-          <w:rFonts w:ascii="Calibri Light" w:eastAsia="SimSun" w:hAnsi="Calibri Light"/>
-          <w:b/>
-          <w:bCs/>
-          <w:color w:val="000000"/>
-          <w:sz w:val="20"/>
-          <w:szCs w:val="20"/>
-          <w:lang w:val="es-ES"/>
-        </w:rPr>
-        <w:t>Testing</w:t>
-      </w:r>
-      <w:proofErr w:type="spellEnd"/>
-      <w:r>
-        <w:rPr>
-          <w:rFonts w:ascii="Calibri Light" w:eastAsia="SimSun" w:hAnsi="Calibri Light"/>
-          <w:b/>
-          <w:bCs/>
-          <w:color w:val="000000"/>
-          <w:sz w:val="20"/>
-          <w:szCs w:val="20"/>
-          <w:lang w:val="es-ES"/>
-        </w:rPr>
-        <w:t xml:space="preserve"> E2E</w:t>
+        <w:t>Backend con Java - Java, Spring Boot, Testing E2E</w:t>
       </w:r>
       <w:r>
         <w:rPr>
@@ -2283,7 +1616,6 @@
         </w:rPr>
         <w:t xml:space="preserve"> - </w:t>
       </w:r>
-      <w:proofErr w:type="spellStart"/>
       <w:r>
         <w:rPr>
           <w:rFonts w:ascii="Calibri Light" w:eastAsia="SimSun" w:hAnsi="Calibri Light"/>
@@ -2296,7 +1628,6 @@
         </w:rPr>
         <w:t>EDteam</w:t>
       </w:r>
-      <w:proofErr w:type="spellEnd"/>
     </w:p>
     <w:p>
       <w:pPr>
@@ -2322,126 +1653,8 @@
           <w:szCs w:val="20"/>
           <w:lang w:val="es-ES"/>
         </w:rPr>
-        <w:t xml:space="preserve">Data </w:t>
-      </w:r>
-      <w:proofErr w:type="spellStart"/>
-      <w:r>
-        <w:rPr>
-          <w:rFonts w:ascii="Calibri Light" w:eastAsia="SimSun" w:hAnsi="Calibri Light" w:cs="Calibri Light"/>
-          <w:b/>
-          <w:bCs/>
-          <w:color w:val="000000"/>
-          <w:sz w:val="20"/>
-          <w:szCs w:val="20"/>
-          <w:lang w:val="es-ES"/>
-        </w:rPr>
-        <w:t>Science</w:t>
-      </w:r>
-      <w:proofErr w:type="spellEnd"/>
-      <w:r>
-        <w:rPr>
-          <w:rFonts w:ascii="Calibri Light" w:eastAsia="SimSun" w:hAnsi="Calibri Light" w:cs="Calibri Light"/>
-          <w:b/>
-          <w:bCs/>
-          <w:color w:val="000000"/>
-          <w:sz w:val="20"/>
-          <w:szCs w:val="20"/>
-          <w:lang w:val="es-ES"/>
-        </w:rPr>
-        <w:t xml:space="preserve"> e IA - Python, Machine </w:t>
-      </w:r>
-      <w:proofErr w:type="spellStart"/>
-      <w:r>
-        <w:rPr>
-          <w:rFonts w:ascii="Calibri Light" w:eastAsia="SimSun" w:hAnsi="Calibri Light" w:cs="Calibri Light"/>
-          <w:b/>
-          <w:bCs/>
-          <w:color w:val="000000"/>
-          <w:sz w:val="20"/>
-          <w:szCs w:val="20"/>
-          <w:lang w:val="es-ES"/>
-        </w:rPr>
-        <w:t>Learning</w:t>
-      </w:r>
-      <w:proofErr w:type="spellEnd"/>
-      <w:r>
-        <w:rPr>
-          <w:rFonts w:ascii="Calibri Light" w:eastAsia="SimSun" w:hAnsi="Calibri Light" w:cs="Calibri Light"/>
-          <w:b/>
-          <w:bCs/>
-          <w:color w:val="000000"/>
-          <w:sz w:val="20"/>
-          <w:szCs w:val="20"/>
-          <w:lang w:val="es-ES"/>
-        </w:rPr>
-        <w:t xml:space="preserve">, Data </w:t>
-      </w:r>
-      <w:proofErr w:type="spellStart"/>
-      <w:r>
-        <w:rPr>
-          <w:rFonts w:ascii="Calibri Light" w:eastAsia="SimSun" w:hAnsi="Calibri Light" w:cs="Calibri Light"/>
-          <w:b/>
-          <w:bCs/>
-          <w:color w:val="000000"/>
-          <w:sz w:val="20"/>
-          <w:szCs w:val="20"/>
-          <w:lang w:val="es-ES"/>
-        </w:rPr>
-        <w:t>Science</w:t>
-      </w:r>
-      <w:proofErr w:type="spellEnd"/>
-      <w:r>
-        <w:rPr>
-          <w:rFonts w:ascii="Calibri Light" w:eastAsia="SimSun" w:hAnsi="Calibri Light" w:cs="Calibri Light"/>
-          <w:b/>
-          <w:bCs/>
-          <w:color w:val="000000"/>
-          <w:sz w:val="20"/>
-          <w:szCs w:val="20"/>
-          <w:lang w:val="es-ES"/>
-        </w:rPr>
-        <w:t xml:space="preserve">, </w:t>
-      </w:r>
-      <w:proofErr w:type="spellStart"/>
-      <w:r>
-        <w:rPr>
-          <w:rFonts w:ascii="Calibri Light" w:eastAsia="SimSun" w:hAnsi="Calibri Light" w:cs="Calibri Light"/>
-          <w:b/>
-          <w:bCs/>
-          <w:color w:val="000000"/>
-          <w:sz w:val="20"/>
-          <w:szCs w:val="20"/>
-          <w:lang w:val="es-ES"/>
-        </w:rPr>
-        <w:t>TensorFlow</w:t>
-      </w:r>
-      <w:proofErr w:type="spellEnd"/>
-      <w:r>
-        <w:rPr>
-          <w:rFonts w:ascii="Calibri Light" w:eastAsia="SimSun" w:hAnsi="Calibri Light" w:cs="Calibri Light"/>
-          <w:b/>
-          <w:bCs/>
-          <w:color w:val="000000"/>
-          <w:sz w:val="20"/>
-          <w:szCs w:val="20"/>
-          <w:lang w:val="es-ES"/>
-        </w:rPr>
-        <w:t xml:space="preserve"> y </w:t>
-      </w:r>
-      <w:proofErr w:type="spellStart"/>
-      <w:r>
-        <w:rPr>
-          <w:rFonts w:ascii="Calibri Light" w:eastAsia="SimSun" w:hAnsi="Calibri Light" w:cs="Calibri Light"/>
-          <w:b/>
-          <w:bCs/>
-          <w:color w:val="000000"/>
-          <w:sz w:val="20"/>
-          <w:szCs w:val="20"/>
-          <w:lang w:val="es-ES"/>
-        </w:rPr>
-        <w:t>PyTorch</w:t>
-      </w:r>
-      <w:proofErr w:type="spellEnd"/>
+        <w:t>Data Science e IA - Python, Machine Learning, Data Science, TensorFlow y PyTorch</w:t>
+      </w:r>
       <w:r>
         <w:rPr>
           <w:rFonts w:ascii="Calibri Light" w:eastAsia="SimSun" w:hAnsi="Calibri Light" w:cs="Calibri Light"/>
@@ -2452,22 +1665,8 @@
           <w:szCs w:val="20"/>
           <w:lang w:val="es-ES"/>
         </w:rPr>
-        <w:t xml:space="preserve"> - </w:t>
-      </w:r>
-      <w:proofErr w:type="spellStart"/>
-      <w:r>
-        <w:rPr>
-          <w:rFonts w:ascii="Calibri Light" w:eastAsia="SimSun" w:hAnsi="Calibri Light" w:cs="Calibri Light"/>
-          <w:i/>
-          <w:iCs/>
-          <w:color w:val="000000"/>
-          <w:sz w:val="20"/>
-          <w:szCs w:val="20"/>
-          <w:lang w:val="es-ES"/>
-        </w:rPr>
-        <w:t>EDteam</w:t>
-      </w:r>
-      <w:proofErr w:type="spellEnd"/>
+        <w:t xml:space="preserve"> - EDteam</w:t>
+      </w:r>
     </w:p>
     <w:p>
       <w:pPr>
@@ -2505,22 +1704,8 @@
           <w:szCs w:val="20"/>
           <w:lang w:val="es-ES"/>
         </w:rPr>
-        <w:t xml:space="preserve"> - </w:t>
-      </w:r>
-      <w:proofErr w:type="spellStart"/>
-      <w:r>
-        <w:rPr>
-          <w:rFonts w:ascii="Calibri Light" w:eastAsia="SimSun" w:hAnsi="Calibri Light" w:cs="Calibri Light"/>
-          <w:i/>
-          <w:iCs/>
-          <w:color w:val="000000"/>
-          <w:sz w:val="20"/>
-          <w:szCs w:val="20"/>
-          <w:lang w:val="es-ES"/>
-        </w:rPr>
-        <w:t>EDteam</w:t>
-      </w:r>
-      <w:proofErr w:type="spellEnd"/>
+        <w:t xml:space="preserve"> - EDteam</w:t>
+      </w:r>
     </w:p>
     <w:p>
       <w:pPr>
@@ -2602,7 +1787,6 @@
         </w:rPr>
         <w:t xml:space="preserve"> - </w:t>
       </w:r>
-      <w:proofErr w:type="spellStart"/>
       <w:r>
         <w:rPr>
           <w:rFonts w:ascii="Calibri Light" w:eastAsia="SimSun" w:hAnsi="Calibri Light" w:cs="Calibri Light"/>
@@ -2615,7 +1799,6 @@
         </w:rPr>
         <w:t>Complusoft</w:t>
       </w:r>
-      <w:proofErr w:type="spellEnd"/>
     </w:p>
     <w:p>
       <w:pPr>
@@ -2643,59 +1826,7 @@
           <w:szCs w:val="20"/>
           <w:lang w:val="es-ES"/>
         </w:rPr>
-        <w:t xml:space="preserve">SOLARIS Fundamentals </w:t>
-      </w:r>
-      <w:proofErr w:type="spellStart"/>
-      <w:r>
-        <w:rPr>
-          <w:rFonts w:ascii="Calibri Light" w:eastAsia="SimSun" w:hAnsi="Calibri Light" w:cs="Calibri Light"/>
-          <w:b/>
-          <w:bCs/>
-          <w:color w:val="000000"/>
-          <w:sz w:val="20"/>
-          <w:szCs w:val="20"/>
-          <w:lang w:val="es-ES"/>
-        </w:rPr>
-        <w:t>for</w:t>
-      </w:r>
-      <w:proofErr w:type="spellEnd"/>
-      <w:r>
-        <w:rPr>
-          <w:rFonts w:ascii="Calibri Light" w:eastAsia="SimSun" w:hAnsi="Calibri Light" w:cs="Calibri Light"/>
-          <w:b/>
-          <w:bCs/>
-          <w:color w:val="000000"/>
-          <w:sz w:val="20"/>
-          <w:szCs w:val="20"/>
-          <w:lang w:val="es-ES"/>
-        </w:rPr>
-        <w:t xml:space="preserve"> </w:t>
-      </w:r>
-      <w:proofErr w:type="spellStart"/>
-      <w:r>
-        <w:rPr>
-          <w:rFonts w:ascii="Calibri Light" w:eastAsia="SimSun" w:hAnsi="Calibri Light" w:cs="Calibri Light"/>
-          <w:b/>
-          <w:bCs/>
-          <w:color w:val="000000"/>
-          <w:sz w:val="20"/>
-          <w:szCs w:val="20"/>
-          <w:lang w:val="es-ES"/>
-        </w:rPr>
-        <w:t>Administrators</w:t>
-      </w:r>
-      <w:proofErr w:type="spellEnd"/>
-      <w:r>
-        <w:rPr>
-          <w:rFonts w:ascii="Calibri Light" w:eastAsia="SimSun" w:hAnsi="Calibri Light" w:cs="Calibri Light"/>
-          <w:b/>
-          <w:bCs/>
-          <w:color w:val="000000"/>
-          <w:sz w:val="20"/>
-          <w:szCs w:val="20"/>
-          <w:lang w:val="es-ES"/>
-        </w:rPr>
-        <w:t xml:space="preserve"> (SA-118)</w:t>
+        <w:t>SOLARIS Fundamentals for Administrators (SA-118)</w:t>
       </w:r>
       <w:r>
         <w:rPr>
@@ -2742,59 +1873,7 @@
           <w:szCs w:val="20"/>
           <w:lang w:val="es-ES"/>
         </w:rPr>
-        <w:t xml:space="preserve">SOLARIS 8 </w:t>
-      </w:r>
-      <w:proofErr w:type="spellStart"/>
-      <w:r>
-        <w:rPr>
-          <w:rFonts w:ascii="Calibri Light" w:eastAsia="SimSun" w:hAnsi="Calibri Light" w:cs="Calibri Light"/>
-          <w:b/>
-          <w:bCs/>
-          <w:color w:val="000000"/>
-          <w:sz w:val="20"/>
-          <w:szCs w:val="20"/>
-          <w:lang w:val="es-ES"/>
-        </w:rPr>
-        <w:t>System</w:t>
-      </w:r>
-      <w:proofErr w:type="spellEnd"/>
-      <w:r>
-        <w:rPr>
-          <w:rFonts w:ascii="Calibri Light" w:eastAsia="SimSun" w:hAnsi="Calibri Light" w:cs="Calibri Light"/>
-          <w:b/>
-          <w:bCs/>
-          <w:color w:val="000000"/>
-          <w:sz w:val="20"/>
-          <w:szCs w:val="20"/>
-          <w:lang w:val="es-ES"/>
-        </w:rPr>
-        <w:t xml:space="preserve"> </w:t>
-      </w:r>
-      <w:proofErr w:type="spellStart"/>
-      <w:r>
-        <w:rPr>
-          <w:rFonts w:ascii="Calibri Light" w:eastAsia="SimSun" w:hAnsi="Calibri Light" w:cs="Calibri Light"/>
-          <w:b/>
-          <w:bCs/>
-          <w:color w:val="000000"/>
-          <w:sz w:val="20"/>
-          <w:szCs w:val="20"/>
-          <w:lang w:val="es-ES"/>
-        </w:rPr>
-        <w:t>Administration</w:t>
-      </w:r>
-      <w:proofErr w:type="spellEnd"/>
-      <w:r>
-        <w:rPr>
-          <w:rFonts w:ascii="Calibri Light" w:eastAsia="SimSun" w:hAnsi="Calibri Light" w:cs="Calibri Light"/>
-          <w:b/>
-          <w:bCs/>
-          <w:color w:val="000000"/>
-          <w:sz w:val="20"/>
-          <w:szCs w:val="20"/>
-          <w:lang w:val="es-ES"/>
-        </w:rPr>
-        <w:t xml:space="preserve"> I y II (SA-238) y (SA-288)</w:t>
+        <w:t>SOLARIS 8 System Administration I y II (SA-238) y (SA-288)</w:t>
       </w:r>
       <w:r>
         <w:rPr>
@@ -2841,33 +1920,7 @@
           <w:szCs w:val="20"/>
           <w:lang w:val="es-ES"/>
         </w:rPr>
-        <w:t xml:space="preserve">SOLARIS 8 Network </w:t>
-      </w:r>
-      <w:proofErr w:type="spellStart"/>
-      <w:r>
-        <w:rPr>
-          <w:rFonts w:ascii="Calibri Light" w:eastAsia="SimSun" w:hAnsi="Calibri Light" w:cs="Calibri Light"/>
-          <w:b/>
-          <w:bCs/>
-          <w:color w:val="000000"/>
-          <w:sz w:val="20"/>
-          <w:szCs w:val="20"/>
-          <w:lang w:val="es-ES"/>
-        </w:rPr>
-        <w:t>Administration</w:t>
-      </w:r>
-      <w:proofErr w:type="spellEnd"/>
-      <w:r>
-        <w:rPr>
-          <w:rFonts w:ascii="Calibri Light" w:eastAsia="SimSun" w:hAnsi="Calibri Light" w:cs="Calibri Light"/>
-          <w:b/>
-          <w:bCs/>
-          <w:color w:val="000000"/>
-          <w:sz w:val="20"/>
-          <w:szCs w:val="20"/>
-          <w:lang w:val="es-ES"/>
-        </w:rPr>
-        <w:t xml:space="preserve"> TCP/IP (SA-389)</w:t>
+        <w:t>SOLARIS 8 Network Administration TCP/IP (SA-389)</w:t>
       </w:r>
       <w:r>
         <w:rPr>
@@ -2904,7 +1957,6 @@
           <w:lang w:val="es-ES"/>
         </w:rPr>
       </w:pPr>
-      <w:proofErr w:type="spellStart"/>
       <w:r>
         <w:rPr>
           <w:rFonts w:ascii="Calibri Light" w:eastAsia="SimSun" w:hAnsi="Calibri Light" w:cs="Calibri Light"/>
@@ -2915,46 +1967,7 @@
           <w:szCs w:val="20"/>
           <w:lang w:val="es-ES"/>
         </w:rPr>
-        <w:t>Interconnecting</w:t>
-      </w:r>
-      <w:proofErr w:type="spellEnd"/>
-      <w:r>
-        <w:rPr>
-          <w:rFonts w:ascii="Calibri Light" w:eastAsia="SimSun" w:hAnsi="Calibri Light" w:cs="Calibri Light"/>
-          <w:b/>
-          <w:bCs/>
-          <w:color w:val="000000"/>
-          <w:sz w:val="20"/>
-          <w:szCs w:val="20"/>
-          <w:lang w:val="es-ES"/>
-        </w:rPr>
-        <w:t xml:space="preserve"> CISCO Network </w:t>
-      </w:r>
-      <w:proofErr w:type="spellStart"/>
-      <w:r>
-        <w:rPr>
-          <w:rFonts w:ascii="Calibri Light" w:eastAsia="SimSun" w:hAnsi="Calibri Light" w:cs="Calibri Light"/>
-          <w:b/>
-          <w:bCs/>
-          <w:color w:val="000000"/>
-          <w:sz w:val="20"/>
-          <w:szCs w:val="20"/>
-          <w:lang w:val="es-ES"/>
-        </w:rPr>
-        <w:t>Devices</w:t>
-      </w:r>
-      <w:proofErr w:type="spellEnd"/>
-      <w:r>
-        <w:rPr>
-          <w:rFonts w:ascii="Calibri Light" w:eastAsia="SimSun" w:hAnsi="Calibri Light" w:cs="Calibri Light"/>
-          <w:b/>
-          <w:bCs/>
-          <w:color w:val="000000"/>
-          <w:sz w:val="20"/>
-          <w:szCs w:val="20"/>
-          <w:lang w:val="es-ES"/>
-        </w:rPr>
-        <w:t xml:space="preserve"> (CCNA)</w:t>
+        <w:t>Interconnecting CISCO Network Devices (CCNA)</w:t>
       </w:r>
       <w:r>
         <w:rPr>
@@ -3239,18 +2252,16 @@
           <w:sz w:val="20"/>
           <w:szCs w:val="20"/>
         </w:rPr>
-        <w:t xml:space="preserve">Node.js, </w:t>
-      </w:r>
-      <w:proofErr w:type="spellStart"/>
-      <w:r>
-        <w:rPr>
-          <w:rFonts w:asciiTheme="majorHAnsi" w:hAnsiTheme="majorHAnsi" w:cstheme="majorHAnsi"/>
-          <w:sz w:val="20"/>
-          <w:szCs w:val="20"/>
-        </w:rPr>
-        <w:t>TypeScript</w:t>
-      </w:r>
-      <w:proofErr w:type="spellEnd"/>
+        <w:t xml:space="preserve">Node.js, TypeScript, </w:t>
+      </w:r>
+      <w:r>
+        <w:rPr>
+          <w:rFonts w:asciiTheme="majorHAnsi" w:hAnsiTheme="majorHAnsi" w:cstheme="majorHAnsi"/>
+          <w:sz w:val="20"/>
+          <w:szCs w:val="20"/>
+        </w:rPr>
+        <w:t>Python, Go, PHP, SQL</w:t>
+      </w:r>
       <w:r>
         <w:rPr>
           <w:rFonts w:asciiTheme="majorHAnsi" w:hAnsiTheme="majorHAnsi" w:cstheme="majorHAnsi"/>
@@ -3265,51 +2276,7 @@
           <w:sz w:val="20"/>
           <w:szCs w:val="20"/>
         </w:rPr>
-        <w:t xml:space="preserve">Python, </w:t>
-      </w:r>
-      <w:proofErr w:type="spellStart"/>
-      <w:r>
-        <w:rPr>
-          <w:rFonts w:asciiTheme="majorHAnsi" w:hAnsiTheme="majorHAnsi" w:cstheme="majorHAnsi"/>
-          <w:sz w:val="20"/>
-          <w:szCs w:val="20"/>
-        </w:rPr>
-        <w:t>Go</w:t>
-      </w:r>
-      <w:proofErr w:type="spellEnd"/>
-      <w:r>
-        <w:rPr>
-          <w:rFonts w:asciiTheme="majorHAnsi" w:hAnsiTheme="majorHAnsi" w:cstheme="majorHAnsi"/>
-          <w:sz w:val="20"/>
-          <w:szCs w:val="20"/>
-        </w:rPr>
-        <w:t>, PHP, SQL</w:t>
-      </w:r>
-      <w:r>
-        <w:rPr>
-          <w:rFonts w:asciiTheme="majorHAnsi" w:hAnsiTheme="majorHAnsi" w:cstheme="majorHAnsi"/>
-          <w:sz w:val="20"/>
-          <w:szCs w:val="20"/>
-        </w:rPr>
-        <w:t xml:space="preserve">, </w:t>
-      </w:r>
-      <w:proofErr w:type="spellStart"/>
-      <w:r>
-        <w:rPr>
-          <w:rFonts w:asciiTheme="majorHAnsi" w:hAnsiTheme="majorHAnsi" w:cstheme="majorHAnsi"/>
-          <w:sz w:val="20"/>
-          <w:szCs w:val="20"/>
-        </w:rPr>
-        <w:t>React</w:t>
-      </w:r>
-      <w:proofErr w:type="spellEnd"/>
-      <w:r>
-        <w:rPr>
-          <w:rFonts w:asciiTheme="majorHAnsi" w:hAnsiTheme="majorHAnsi" w:cstheme="majorHAnsi"/>
-          <w:sz w:val="20"/>
-          <w:szCs w:val="20"/>
-        </w:rPr>
-        <w:t>, Vue, Angular</w:t>
+        <w:t>React, Vue, Angular</w:t>
       </w:r>
     </w:p>
     <w:p>
@@ -3373,7 +2340,6 @@
           <w:szCs w:val="20"/>
         </w:rPr>
       </w:pPr>
-      <w:proofErr w:type="spellStart"/>
       <w:r>
         <w:rPr>
           <w:rFonts w:asciiTheme="majorHAnsi" w:hAnsiTheme="majorHAnsi" w:cstheme="majorHAnsi"/>
@@ -3382,7 +2348,6 @@
         </w:rPr>
         <w:t>Agents</w:t>
       </w:r>
-      <w:proofErr w:type="spellEnd"/>
       <w:r>
         <w:rPr>
           <w:rFonts w:asciiTheme="majorHAnsi" w:hAnsiTheme="majorHAnsi" w:cstheme="majorHAnsi"/>
@@ -3401,16 +2366,30 @@
         </w:rPr>
         <w:t xml:space="preserve">Claude, </w:t>
       </w:r>
-      <w:proofErr w:type="spellStart"/>
-      <w:r>
-        <w:rPr>
-          <w:rFonts w:asciiTheme="majorHAnsi" w:hAnsiTheme="majorHAnsi" w:cstheme="majorHAnsi"/>
-          <w:sz w:val="20"/>
-          <w:szCs w:val="20"/>
-        </w:rPr>
-        <w:t>Antigravity</w:t>
-      </w:r>
-      <w:proofErr w:type="spellEnd"/>
+      <w:r>
+        <w:rPr>
+          <w:rFonts w:asciiTheme="majorHAnsi" w:hAnsiTheme="majorHAnsi" w:cstheme="majorHAnsi"/>
+          <w:sz w:val="20"/>
+          <w:szCs w:val="20"/>
+        </w:rPr>
+        <w:t xml:space="preserve">Antigravity, </w:t>
+      </w:r>
+      <w:r>
+        <w:rPr>
+          <w:rFonts w:asciiTheme="majorHAnsi" w:hAnsiTheme="majorHAnsi" w:cstheme="majorHAnsi"/>
+          <w:sz w:val="20"/>
+          <w:szCs w:val="20"/>
+        </w:rPr>
+        <w:t>Codex</w:t>
+      </w:r>
+      <w:r>
+        <w:rPr>
+          <w:rFonts w:asciiTheme="majorHAnsi" w:hAnsiTheme="majorHAnsi" w:cstheme="majorHAnsi"/>
+          <w:sz w:val="20"/>
+          <w:szCs w:val="20"/>
+        </w:rPr>
+        <w:t>)</w:t>
+      </w:r>
       <w:r>
         <w:rPr>
           <w:rFonts w:asciiTheme="majorHAnsi" w:hAnsiTheme="majorHAnsi" w:cstheme="majorHAnsi"/>
@@ -3425,15 +2404,7 @@
           <w:sz w:val="20"/>
           <w:szCs w:val="20"/>
         </w:rPr>
-        <w:t>Codex</w:t>
-      </w:r>
-      <w:r>
-        <w:rPr>
-          <w:rFonts w:asciiTheme="majorHAnsi" w:hAnsiTheme="majorHAnsi" w:cstheme="majorHAnsi"/>
-          <w:sz w:val="20"/>
-          <w:szCs w:val="20"/>
-        </w:rPr>
-        <w:t>)</w:t>
+        <w:t>OpenAI, Copilot, Gemini, DeepSeek</w:t>
       </w:r>
       <w:r>
         <w:rPr>
@@ -3443,60 +2414,6 @@
         </w:rPr>
         <w:t xml:space="preserve">, </w:t>
       </w:r>
-      <w:proofErr w:type="spellStart"/>
-      <w:r>
-        <w:rPr>
-          <w:rFonts w:asciiTheme="majorHAnsi" w:hAnsiTheme="majorHAnsi" w:cstheme="majorHAnsi"/>
-          <w:sz w:val="20"/>
-          <w:szCs w:val="20"/>
-        </w:rPr>
-        <w:t>OpenAI</w:t>
-      </w:r>
-      <w:proofErr w:type="spellEnd"/>
-      <w:r>
-        <w:rPr>
-          <w:rFonts w:asciiTheme="majorHAnsi" w:hAnsiTheme="majorHAnsi" w:cstheme="majorHAnsi"/>
-          <w:sz w:val="20"/>
-          <w:szCs w:val="20"/>
-        </w:rPr>
-        <w:t xml:space="preserve">, </w:t>
-      </w:r>
-      <w:proofErr w:type="spellStart"/>
-      <w:r>
-        <w:rPr>
-          <w:rFonts w:asciiTheme="majorHAnsi" w:hAnsiTheme="majorHAnsi" w:cstheme="majorHAnsi"/>
-          <w:sz w:val="20"/>
-          <w:szCs w:val="20"/>
-        </w:rPr>
-        <w:t>Copilot</w:t>
-      </w:r>
-      <w:proofErr w:type="spellEnd"/>
-      <w:r>
-        <w:rPr>
-          <w:rFonts w:asciiTheme="majorHAnsi" w:hAnsiTheme="majorHAnsi" w:cstheme="majorHAnsi"/>
-          <w:sz w:val="20"/>
-          <w:szCs w:val="20"/>
-        </w:rPr>
-        <w:t xml:space="preserve">, Gemini, </w:t>
-      </w:r>
-      <w:proofErr w:type="spellStart"/>
-      <w:r>
-        <w:rPr>
-          <w:rFonts w:asciiTheme="majorHAnsi" w:hAnsiTheme="majorHAnsi" w:cstheme="majorHAnsi"/>
-          <w:sz w:val="20"/>
-          <w:szCs w:val="20"/>
-        </w:rPr>
-        <w:t>DeepSeek</w:t>
-      </w:r>
-      <w:proofErr w:type="spellEnd"/>
-      <w:r>
-        <w:rPr>
-          <w:rFonts w:asciiTheme="majorHAnsi" w:hAnsiTheme="majorHAnsi" w:cstheme="majorHAnsi"/>
-          <w:sz w:val="20"/>
-          <w:szCs w:val="20"/>
-        </w:rPr>
-        <w:t xml:space="preserve">, </w:t>
-      </w:r>
       <w:r>
         <w:rPr>
           <w:rFonts w:asciiTheme="majorHAnsi" w:hAnsiTheme="majorHAnsi" w:cstheme="majorHAnsi"/>
@@ -3505,34 +2422,14 @@
         </w:rPr>
         <w:t xml:space="preserve">GenAI, </w:t>
       </w:r>
-      <w:proofErr w:type="spellStart"/>
-      <w:r>
-        <w:rPr>
-          <w:rFonts w:asciiTheme="majorHAnsi" w:hAnsiTheme="majorHAnsi" w:cstheme="majorHAnsi"/>
-          <w:sz w:val="20"/>
-          <w:szCs w:val="20"/>
-        </w:rPr>
-        <w:t>Prompt</w:t>
-      </w:r>
-      <w:proofErr w:type="spellEnd"/>
-      <w:r>
-        <w:rPr>
-          <w:rFonts w:asciiTheme="majorHAnsi" w:hAnsiTheme="majorHAnsi" w:cstheme="majorHAnsi"/>
-          <w:sz w:val="20"/>
-          <w:szCs w:val="20"/>
-        </w:rPr>
-        <w:t xml:space="preserve"> </w:t>
-      </w:r>
-      <w:proofErr w:type="spellStart"/>
-      <w:r>
-        <w:rPr>
-          <w:rFonts w:asciiTheme="majorHAnsi" w:hAnsiTheme="majorHAnsi" w:cstheme="majorHAnsi"/>
-          <w:sz w:val="20"/>
-          <w:szCs w:val="20"/>
-        </w:rPr>
-        <w:t>Engineering</w:t>
-      </w:r>
-      <w:proofErr w:type="spellEnd"/>
+      <w:r>
+        <w:rPr>
+          <w:rFonts w:asciiTheme="majorHAnsi" w:hAnsiTheme="majorHAnsi" w:cstheme="majorHAnsi"/>
+          <w:sz w:val="20"/>
+          <w:szCs w:val="20"/>
+        </w:rPr>
+        <w:t>Prompt Engineering</w:t>
+      </w:r>
       <w:r>
         <w:rPr>
           <w:rFonts w:asciiTheme="majorHAnsi" w:hAnsiTheme="majorHAnsi" w:cstheme="majorHAnsi"/>
@@ -3621,25 +2518,7 @@
           <w:sz w:val="20"/>
           <w:szCs w:val="20"/>
         </w:rPr>
-        <w:t xml:space="preserve"> </w:t>
-      </w:r>
-      <w:proofErr w:type="spellStart"/>
-      <w:r>
-        <w:rPr>
-          <w:rFonts w:asciiTheme="majorHAnsi" w:hAnsiTheme="majorHAnsi" w:cstheme="majorHAnsi"/>
-          <w:sz w:val="20"/>
-          <w:szCs w:val="20"/>
-        </w:rPr>
-        <w:t>APIs</w:t>
-      </w:r>
-      <w:proofErr w:type="spellEnd"/>
-      <w:r>
-        <w:rPr>
-          <w:rFonts w:asciiTheme="majorHAnsi" w:hAnsiTheme="majorHAnsi" w:cstheme="majorHAnsi"/>
-          <w:sz w:val="20"/>
-          <w:szCs w:val="20"/>
-        </w:rPr>
-        <w:t xml:space="preserve"> REST, Arquitecturas Escalables</w:t>
+        <w:t xml:space="preserve"> APIs REST, Arquitecturas Escalables</w:t>
       </w:r>
     </w:p>
     <w:p>
@@ -3689,90 +2568,8 @@
           <w:sz w:val="20"/>
           <w:szCs w:val="20"/>
         </w:rPr>
-        <w:t xml:space="preserve">GA4, </w:t>
-      </w:r>
-      <w:proofErr w:type="spellStart"/>
-      <w:r>
-        <w:rPr>
-          <w:rFonts w:asciiTheme="majorHAnsi" w:hAnsiTheme="majorHAnsi" w:cstheme="majorHAnsi"/>
-          <w:sz w:val="20"/>
-          <w:szCs w:val="20"/>
-        </w:rPr>
-        <w:t>Semrush</w:t>
-      </w:r>
-      <w:proofErr w:type="spellEnd"/>
-      <w:r>
-        <w:rPr>
-          <w:rFonts w:asciiTheme="majorHAnsi" w:hAnsiTheme="majorHAnsi" w:cstheme="majorHAnsi"/>
-          <w:sz w:val="20"/>
-          <w:szCs w:val="20"/>
-        </w:rPr>
-        <w:t xml:space="preserve">, </w:t>
-      </w:r>
-      <w:proofErr w:type="spellStart"/>
-      <w:r>
-        <w:rPr>
-          <w:rFonts w:asciiTheme="majorHAnsi" w:hAnsiTheme="majorHAnsi" w:cstheme="majorHAnsi"/>
-          <w:sz w:val="20"/>
-          <w:szCs w:val="20"/>
-        </w:rPr>
-        <w:t>Ahrefs</w:t>
-      </w:r>
-      <w:proofErr w:type="spellEnd"/>
-      <w:r>
-        <w:rPr>
-          <w:rFonts w:asciiTheme="majorHAnsi" w:hAnsiTheme="majorHAnsi" w:cstheme="majorHAnsi"/>
-          <w:sz w:val="20"/>
-          <w:szCs w:val="20"/>
-        </w:rPr>
-        <w:t xml:space="preserve">, </w:t>
-      </w:r>
-      <w:proofErr w:type="spellStart"/>
-      <w:r>
-        <w:rPr>
-          <w:rFonts w:asciiTheme="majorHAnsi" w:hAnsiTheme="majorHAnsi" w:cstheme="majorHAnsi"/>
-          <w:sz w:val="20"/>
-          <w:szCs w:val="20"/>
-        </w:rPr>
-        <w:t>Sistrix</w:t>
-      </w:r>
-      <w:proofErr w:type="spellEnd"/>
-      <w:r>
-        <w:rPr>
-          <w:rFonts w:asciiTheme="majorHAnsi" w:hAnsiTheme="majorHAnsi" w:cstheme="majorHAnsi"/>
-          <w:sz w:val="20"/>
-          <w:szCs w:val="20"/>
-        </w:rPr>
-        <w:t xml:space="preserve">, </w:t>
-      </w:r>
-      <w:proofErr w:type="spellStart"/>
-      <w:r>
-        <w:rPr>
-          <w:rFonts w:asciiTheme="majorHAnsi" w:hAnsiTheme="majorHAnsi" w:cstheme="majorHAnsi"/>
-          <w:sz w:val="20"/>
-          <w:szCs w:val="20"/>
-        </w:rPr>
-        <w:t>Screaming</w:t>
-      </w:r>
-      <w:proofErr w:type="spellEnd"/>
-      <w:r>
-        <w:rPr>
-          <w:rFonts w:asciiTheme="majorHAnsi" w:hAnsiTheme="majorHAnsi" w:cstheme="majorHAnsi"/>
-          <w:sz w:val="20"/>
-          <w:szCs w:val="20"/>
-        </w:rPr>
-        <w:t xml:space="preserve"> </w:t>
-      </w:r>
-      <w:proofErr w:type="spellStart"/>
-      <w:r>
-        <w:rPr>
-          <w:rFonts w:asciiTheme="majorHAnsi" w:hAnsiTheme="majorHAnsi" w:cstheme="majorHAnsi"/>
-          <w:sz w:val="20"/>
-          <w:szCs w:val="20"/>
-        </w:rPr>
-        <w:t>Frog</w:t>
-      </w:r>
-      <w:proofErr w:type="spellEnd"/>
+        <w:t>GA4, Semrush, Ahrefs, Sistrix, Screaming Frog</w:t>
+      </w:r>
     </w:p>
     <w:p>
       <w:pPr>
@@ -3821,25 +2618,7 @@
           <w:sz w:val="20"/>
           <w:szCs w:val="20"/>
         </w:rPr>
-        <w:t xml:space="preserve">Windows Server, Active </w:t>
-      </w:r>
-      <w:proofErr w:type="spellStart"/>
-      <w:r>
-        <w:rPr>
-          <w:rFonts w:asciiTheme="majorHAnsi" w:hAnsiTheme="majorHAnsi" w:cstheme="majorHAnsi"/>
-          <w:sz w:val="20"/>
-          <w:szCs w:val="20"/>
-        </w:rPr>
-        <w:t>Directory</w:t>
-      </w:r>
-      <w:proofErr w:type="spellEnd"/>
-      <w:r>
-        <w:rPr>
-          <w:rFonts w:asciiTheme="majorHAnsi" w:hAnsiTheme="majorHAnsi" w:cstheme="majorHAnsi"/>
-          <w:sz w:val="20"/>
-          <w:szCs w:val="20"/>
-        </w:rPr>
-        <w:t>, Linux, Solaris, Citrix</w:t>
+        <w:t>Windows Server, Active Directory, Linux, Solaris, Citrix</w:t>
       </w:r>
     </w:p>
     <w:p>
@@ -3968,7 +2747,6 @@
         </w:rPr>
         <w:t xml:space="preserve"> </w:t>
       </w:r>
-      <w:proofErr w:type="gramStart"/>
       <w:r>
         <w:rPr>
           <w:rFonts w:asciiTheme="majorHAnsi" w:hAnsiTheme="majorHAnsi" w:cstheme="majorHAnsi"/>
@@ -3979,7 +2757,6 @@
         </w:rPr>
         <w:t>Inglés</w:t>
       </w:r>
-      <w:proofErr w:type="gramEnd"/>
       <w:r>
         <w:rPr>
           <w:rFonts w:asciiTheme="majorHAnsi" w:hAnsiTheme="majorHAnsi" w:cstheme="majorHAnsi"/>
@@ -4023,21 +2800,12 @@
           <w:szCs w:val="20"/>
         </w:rPr>
       </w:pPr>
-      <w:proofErr w:type="spellStart"/>
       <w:r>
         <w:rPr>
           <w:sz w:val="18"/>
           <w:szCs w:val="18"/>
         </w:rPr>
-        <w:t>Tef</w:t>
-      </w:r>
-      <w:proofErr w:type="spellEnd"/>
-      <w:r>
-        <w:rPr>
-          <w:sz w:val="18"/>
-          <w:szCs w:val="18"/>
-        </w:rPr>
-        <w:t xml:space="preserve">.: </w:t>
+        <w:t xml:space="preserve">Tef.: </w:t>
       </w:r>
       <w:r>
         <w:rPr>
@@ -4082,23 +2850,13 @@
         </w:rPr>
         <w:t xml:space="preserve">                                                                                                                     </w:t>
       </w:r>
-      <w:proofErr w:type="spellStart"/>
-      <w:r>
-        <w:rPr>
-          <w:rFonts w:asciiTheme="majorHAnsi" w:hAnsiTheme="majorHAnsi" w:cstheme="majorHAnsi"/>
-          <w:sz w:val="20"/>
-          <w:szCs w:val="20"/>
-        </w:rPr>
-        <w:t>Linkedln</w:t>
-      </w:r>
-      <w:proofErr w:type="spellEnd"/>
-      <w:r>
-        <w:rPr>
-          <w:rFonts w:asciiTheme="majorHAnsi" w:hAnsiTheme="majorHAnsi" w:cstheme="majorHAnsi"/>
-          <w:sz w:val="20"/>
-          <w:szCs w:val="20"/>
-        </w:rPr>
-        <w:t xml:space="preserve">: </w:t>
+      <w:r>
+        <w:rPr>
+          <w:rFonts w:asciiTheme="majorHAnsi" w:hAnsiTheme="majorHAnsi" w:cstheme="majorHAnsi"/>
+          <w:sz w:val="20"/>
+          <w:szCs w:val="20"/>
+        </w:rPr>
+        <w:t xml:space="preserve">Linkedln: </w:t>
       </w:r>
       <w:hyperlink r:id="rId9" w:history="1">
         <w:r>
@@ -4119,23 +2877,13 @@
         </w:rPr>
         <w:t xml:space="preserve"> - </w:t>
       </w:r>
-      <w:proofErr w:type="gramStart"/>
-      <w:r>
-        <w:rPr>
-          <w:rFonts w:asciiTheme="majorHAnsi" w:hAnsiTheme="majorHAnsi" w:cstheme="majorHAnsi"/>
-          <w:sz w:val="20"/>
-          <w:szCs w:val="20"/>
-        </w:rPr>
-        <w:t>Portfolio</w:t>
-      </w:r>
-      <w:proofErr w:type="gramEnd"/>
-      <w:r>
-        <w:rPr>
-          <w:rFonts w:asciiTheme="majorHAnsi" w:hAnsiTheme="majorHAnsi" w:cstheme="majorHAnsi"/>
-          <w:sz w:val="20"/>
-          <w:szCs w:val="20"/>
-        </w:rPr>
-        <w:t xml:space="preserve">: </w:t>
+      <w:r>
+        <w:rPr>
+          <w:rFonts w:asciiTheme="majorHAnsi" w:hAnsiTheme="majorHAnsi" w:cstheme="majorHAnsi"/>
+          <w:sz w:val="20"/>
+          <w:szCs w:val="20"/>
+        </w:rPr>
+        <w:t xml:space="preserve">Portfolio: </w:t>
       </w:r>
       <w:hyperlink r:id="rId10" w:history="1">
         <w:r>
@@ -4145,25 +2893,7 @@
             <w:sz w:val="20"/>
             <w:szCs w:val="20"/>
           </w:rPr>
-          <w:t>https://portfolio-carlosjua</w:t>
-        </w:r>
-        <w:r>
-          <w:rPr>
-            <w:rStyle w:val="Hipervnculo"/>
-            <w:rFonts w:asciiTheme="majorHAnsi" w:hAnsiTheme="majorHAnsi" w:cstheme="majorHAnsi"/>
-            <w:sz w:val="20"/>
-            <w:szCs w:val="20"/>
-          </w:rPr>
-          <w:t>r</w:t>
-        </w:r>
-        <w:r>
-          <w:rPr>
-            <w:rStyle w:val="Hipervnculo"/>
-            <w:rFonts w:asciiTheme="majorHAnsi" w:hAnsiTheme="majorHAnsi" w:cstheme="majorHAnsi"/>
-            <w:sz w:val="20"/>
-            <w:szCs w:val="20"/>
-          </w:rPr>
-          <w:t>ez.onrender.com</w:t>
+          <w:t>https://portfolio-carlosjuarez.onrender.com</w:t>
         </w:r>
       </w:hyperlink>
       <w:r>

</xml_diff>